<commit_message>
feat: cahier des charges
</commit_message>
<xml_diff>
--- a/Waitless-Cahier-des-charges.docx
+++ b/Waitless-Cahier-des-charges.docx
@@ -797,6 +797,11 @@
         </w:rPr>
         <w:t xml:space="preserve"> passées sur place avant l'entrée.</w:t>
       </w:r>
+      <w:r>
+        <w:rPr>
+          <w:rtl w:val="0"/>
+        </w:rPr>
+      </w:r>
     </w:p>
     <w:p>
       <w:pPr>
@@ -840,6 +845,11 @@
         </w:rPr>
         <w:t xml:space="preserve">Rendre l'attente prévisible : écart inférieur à 10 % entre le temps annoncé et le temps réel.</w:t>
       </w:r>
+      <w:r>
+        <w:rPr>
+          <w:rtl w:val="0"/>
+        </w:rPr>
+      </w:r>
     </w:p>
     <w:p>
       <w:pPr>
@@ -883,6 +893,11 @@
         </w:rPr>
         <w:t xml:space="preserve">Faire vivre trois statuts de visiteurs (Humain, Saiyan, Super Saiyan) sans sacrifier la file classique.</w:t>
       </w:r>
+      <w:r>
+        <w:rPr>
+          <w:rtl w:val="0"/>
+        </w:rPr>
+      </w:r>
     </w:p>
     <w:p>
       <w:pPr>
@@ -926,6 +941,11 @@
         </w:rPr>
         <w:t xml:space="preserve">Ne jamais promettre un passage impossible à honorer avant la fermeture de 19h00.</w:t>
       </w:r>
+      <w:r>
+        <w:rPr>
+          <w:rtl w:val="0"/>
+        </w:rPr>
+      </w:r>
     </w:p>
     <w:p>
       <w:pPr>
@@ -969,6 +989,11 @@
         </w:rPr>
         <w:t xml:space="preserve">Résister aux incidents : aucune perte de position en cas de panne ou d'arrêt de service.</w:t>
       </w:r>
+      <w:r>
+        <w:rPr>
+          <w:rtl w:val="0"/>
+        </w:rPr>
+      </w:r>
     </w:p>
     <w:p>
       <w:pPr>
@@ -1011,6 +1036,11 @@
           <w:rtl w:val="0"/>
         </w:rPr>
         <w:t xml:space="preserve">Collecter le strict minimum de données personnelles, sous contrôle du DPO du parc.</w:t>
+      </w:r>
+      <w:r>
+        <w:rPr>
+          <w:rtl w:val="0"/>
+        </w:rPr>
       </w:r>
     </w:p>
     <w:p>
@@ -1247,7 +1277,7 @@
                 <w:szCs w:val="18"/>
                 <w:rtl w:val="0"/>
               </w:rPr>
-              <w:t xml:space="preserve">Cycle de 20 minutes pour 20 visiteurs, soit un débit nominal de 60 visiteurs par heure</w:t>
+              <w:t xml:space="preserve">Environ 8000 visiteurs</w:t>
             </w:r>
             <w:r>
               <w:rPr>
@@ -2434,6 +2464,11 @@
         </w:rPr>
         <w:t xml:space="preserve">Le visiteur se connecte par un lien.</w:t>
       </w:r>
+      <w:r>
+        <w:rPr>
+          <w:rtl w:val="0"/>
+        </w:rPr>
+      </w:r>
     </w:p>
     <w:p>
       <w:pPr>
@@ -2477,6 +2512,11 @@
         </w:rPr>
         <w:t xml:space="preserve">Il accepte les conditions et la décharge de responsabilité liée à la forte pesanteur, puis déclare son aptitude ; seul le statut « apte » ou « non apte » est conservé.</w:t>
       </w:r>
+      <w:r>
+        <w:rPr>
+          <w:rtl w:val="0"/>
+        </w:rPr>
+      </w:r>
     </w:p>
     <w:p>
       <w:pPr>
@@ -2520,6 +2560,11 @@
         </w:rPr>
         <w:t xml:space="preserve">L'application affiche l'attente estimée pour son statut et l'heure prévisionnelle de clôture des inscriptions.</w:t>
       </w:r>
+      <w:r>
+        <w:rPr>
+          <w:rtl w:val="0"/>
+        </w:rPr>
+      </w:r>
     </w:p>
     <w:p>
       <w:pPr>
@@ -2563,6 +2608,11 @@
         </w:rPr>
         <w:t xml:space="preserve">Il rejoint la file : un ticket est créé avec un rang d'arrivée définitif et une estimation sous forme de fourchette.</w:t>
       </w:r>
+      <w:r>
+        <w:rPr>
+          <w:rtl w:val="0"/>
+        </w:rPr>
+      </w:r>
     </w:p>
     <w:p>
       <w:pPr>
@@ -2606,6 +2656,11 @@
         </w:rPr>
         <w:t xml:space="preserve">Un Super Saiyan est convoqué immédiatement ; un Saiyan ne peut s'inscrire que si la garantie de 30 minutes reste tenable.</w:t>
       </w:r>
+      <w:r>
+        <w:rPr>
+          <w:rtl w:val="0"/>
+        </w:rPr>
+      </w:r>
     </w:p>
     <w:p>
       <w:pPr>
@@ -2672,6 +2727,11 @@
         </w:rPr>
         <w:t xml:space="preserve">Le visiteur quitte l'application et profite du parc ; sa position est recalculée toutes les 30 secondes.</w:t>
       </w:r>
+      <w:r>
+        <w:rPr>
+          <w:rtl w:val="0"/>
+        </w:rPr>
+      </w:r>
     </w:p>
     <w:p>
       <w:pPr>
@@ -2715,6 +2775,11 @@
         </w:rPr>
         <w:t xml:space="preserve">Il est notifié si l'estimation se dégrade nettement, et averti si la fermeture de 19h00 menace son passage.</w:t>
       </w:r>
+      <w:r>
+        <w:rPr>
+          <w:rtl w:val="0"/>
+        </w:rPr>
+      </w:r>
     </w:p>
     <w:p>
       <w:pPr>
@@ -2758,6 +2823,11 @@
         </w:rPr>
         <w:t xml:space="preserve">Lorsque des places se libèrent, le système le convoque par e-mail : il dispose de 10 minutes pour se présenter.</w:t>
       </w:r>
+      <w:r>
+        <w:rPr>
+          <w:rtl w:val="0"/>
+        </w:rPr>
+      </w:r>
     </w:p>
     <w:p>
       <w:pPr>
@@ -2826,6 +2896,11 @@
         </w:rPr>
         <w:t xml:space="preserve">, à l'agent d'accès.</w:t>
       </w:r>
+      <w:r>
+        <w:rPr>
+          <w:rtl w:val="0"/>
+        </w:rPr>
+      </w:r>
     </w:p>
     <w:p>
       <w:pPr>
@@ -2868,6 +2943,11 @@
           <w:rtl w:val="0"/>
         </w:rPr>
         <w:t xml:space="preserve">L'agent scanne, obtient un verdict immédiat, contrôle la pièce d'identité puis valide l'entrée.</w:t>
+      </w:r>
+      <w:r>
+        <w:rPr>
+          <w:rtl w:val="0"/>
+        </w:rPr>
       </w:r>
     </w:p>
     <w:p>
@@ -6617,6 +6697,11 @@
         </w:rPr>
         <w:t xml:space="preserve">Le débit nominal de l'attraction est corrigé par le débit réellement observé et par l'occupation de la salle d'attente mesurée par le capteur.</w:t>
       </w:r>
+      <w:r>
+        <w:rPr>
+          <w:rtl w:val="0"/>
+        </w:rPr>
+      </w:r>
     </w:p>
     <w:p>
       <w:pPr>
@@ -6660,6 +6745,11 @@
         </w:rPr>
         <w:t xml:space="preserve">L'attente d'un nouveau ticket intègre les passages prioritaires attendus pendant cette attente, par un calcul itératif qui converge en quelques passes.</w:t>
       </w:r>
+      <w:r>
+        <w:rPr>
+          <w:rtl w:val="0"/>
+        </w:rPr>
+      </w:r>
     </w:p>
     <w:p>
       <w:pPr>
@@ -6703,6 +6793,11 @@
         </w:rPr>
         <w:t xml:space="preserve">Une fourchette est affichée plutôt qu'une valeur sèche ; elle s'élargit après un incident ou en cas de contexte défavorable.</w:t>
       </w:r>
+      <w:r>
+        <w:rPr>
+          <w:rtl w:val="0"/>
+        </w:rPr>
+      </w:r>
     </w:p>
     <w:p>
       <w:pPr>
@@ -6745,6 +6840,11 @@
           <w:rtl w:val="0"/>
         </w:rPr>
         <w:t xml:space="preserve">La sélection des visiteurs à convoquer combine l'échéance des garanties, les quotas par statut et l'ordre d'arrivée.</w:t>
+      </w:r>
+      <w:r>
+        <w:rPr>
+          <w:rtl w:val="0"/>
+        </w:rPr>
       </w:r>
     </w:p>
     <w:p>
@@ -9893,6 +9993,11 @@
         </w:rPr>
         <w:t xml:space="preserve">Le visiteur se connecte par lien e-mail à usage unique : aucun mot de passe, donc aucune donnée d'authentification à protéger.</w:t>
       </w:r>
+      <w:r>
+        <w:rPr>
+          <w:rtl w:val="0"/>
+        </w:rPr>
+      </w:r>
     </w:p>
     <w:p>
       <w:pPr>
@@ -9936,6 +10041,11 @@
         </w:rPr>
         <w:t xml:space="preserve">Le QR code est nominatif et régénéré toutes les 30 secondes : une capture d'écran partagée devient inutilisable en quelques instants.</w:t>
       </w:r>
+      <w:r>
+        <w:rPr>
+          <w:rtl w:val="0"/>
+        </w:rPr>
+      </w:r>
     </w:p>
     <w:p>
       <w:pPr>
@@ -9979,6 +10089,11 @@
         </w:rPr>
         <w:t xml:space="preserve">Chaque jeton n'est utilisable qu'une fois et n'est valable que le jour même, la clé de signature étant dérivée de la date d'exploitation.</w:t>
       </w:r>
+      <w:r>
+        <w:rPr>
+          <w:rtl w:val="0"/>
+        </w:rPr>
+      </w:r>
     </w:p>
     <w:p>
       <w:pPr>
@@ -10022,6 +10137,11 @@
         </w:rPr>
         <w:t xml:space="preserve">Le jeton n'est actif qu'entre la convocation et l'expiration du délai ; un désistement, un retrait ou une purge le révoquent immédiatement.</w:t>
       </w:r>
+      <w:r>
+        <w:rPr>
+          <w:rtl w:val="0"/>
+        </w:rPr>
+      </w:r>
     </w:p>
     <w:p>
       <w:pPr>
@@ -10064,6 +10184,11 @@
           <w:rtl w:val="0"/>
         </w:rPr>
         <w:t xml:space="preserve">Le QR ne vaut pas identité : l'agent contrôle la pièce d'identité physique, sans en saisir ni en conserver la moindre donnée.</w:t>
+      </w:r>
+      <w:r>
+        <w:rPr>
+          <w:rtl w:val="0"/>
+        </w:rPr>
       </w:r>
     </w:p>
     <w:p>
@@ -11059,6 +11184,11 @@
         </w:rPr>
         <w:t xml:space="preserve">Inscription du traitement au registre du parc et contrat de sous-traitance avec Waitless.</w:t>
       </w:r>
+      <w:r>
+        <w:rPr>
+          <w:rtl w:val="0"/>
+        </w:rPr>
+      </w:r>
     </w:p>
     <w:p>
       <w:pPr>
@@ -11102,6 +11232,11 @@
         </w:rPr>
         <w:t xml:space="preserve">Formulation de la question d'aptitude en auto-déclaration, afin qu'aucune pathologie ne soit jamais transmise.</w:t>
       </w:r>
+      <w:r>
+        <w:rPr>
+          <w:rtl w:val="0"/>
+        </w:rPr>
+      </w:r>
     </w:p>
     <w:p>
       <w:pPr>
@@ -11145,6 +11280,11 @@
         </w:rPr>
         <w:t xml:space="preserve">Information sur site concernant le capteur de présence et justification de sa finalité strictement opérationnelle.</w:t>
       </w:r>
+      <w:r>
+        <w:rPr>
+          <w:rtl w:val="0"/>
+        </w:rPr>
+      </w:r>
     </w:p>
     <w:p>
       <w:pPr>
@@ -11188,6 +11328,11 @@
         </w:rPr>
         <w:t xml:space="preserve">Validation des durées de conservation et de la politique d'anonymisation.</w:t>
       </w:r>
+      <w:r>
+        <w:rPr>
+          <w:rtl w:val="0"/>
+        </w:rPr>
+      </w:r>
     </w:p>
     <w:p>
       <w:pPr>
@@ -11231,6 +11376,11 @@
         </w:rPr>
         <w:t xml:space="preserve">Opportunité d'une analyse d'impact allégée, à trancher au regard de la question d'aptitude et du capteur.</w:t>
       </w:r>
+      <w:r>
+        <w:rPr>
+          <w:rtl w:val="0"/>
+        </w:rPr>
+      </w:r>
     </w:p>
     <w:p>
       <w:pPr>
@@ -11273,6 +11423,11 @@
           <w:rtl w:val="0"/>
         </w:rPr>
         <w:t xml:space="preserve">Exercice des droits (accès, export, effacement, retrait du consentement) directement dans l'application.</w:t>
+      </w:r>
+      <w:r>
+        <w:rPr>
+          <w:rtl w:val="0"/>
+        </w:rPr>
       </w:r>
     </w:p>
     <w:p>
@@ -12957,6 +13112,11 @@
         </w:rPr>
         <w:t xml:space="preserve">Capacité et durée réelles d’un cycle de la Salle du Temps.</w:t>
       </w:r>
+      <w:r>
+        <w:rPr>
+          <w:rtl w:val="0"/>
+        </w:rPr>
+      </w:r>
     </w:p>
     <w:p>
       <w:pPr>
@@ -13000,6 +13160,11 @@
         </w:rPr>
         <w:t xml:space="preserve">Mode d'attribution des statuts : billetterie amont ou surclassement dans l'application.</w:t>
       </w:r>
+      <w:r>
+        <w:rPr>
+          <w:rtl w:val="0"/>
+        </w:rPr>
+      </w:r>
     </w:p>
     <w:p>
       <w:pPr>
@@ -13043,6 +13208,11 @@
         </w:rPr>
         <w:t xml:space="preserve">Geste commercial éventuel pour un visiteur non servi à la fermeture.</w:t>
       </w:r>
+      <w:r>
+        <w:rPr>
+          <w:rtl w:val="0"/>
+        </w:rPr>
+      </w:r>
     </w:p>
     <w:p>
       <w:pPr>
@@ -13086,6 +13256,11 @@
         </w:rPr>
         <w:t xml:space="preserve">Gestion des groupes et des familles : un ticket par personne ou un ticket collectif.</w:t>
       </w:r>
+      <w:r>
+        <w:rPr>
+          <w:rtl w:val="0"/>
+        </w:rPr>
+      </w:r>
     </w:p>
     <w:p>
       <w:pPr>
@@ -13128,6 +13303,11 @@
           <w:rtl w:val="0"/>
         </w:rPr>
         <w:t xml:space="preserve">Ajout d'un canal de notification complémentaire (push ou SMS).</w:t>
+      </w:r>
+      <w:r>
+        <w:rPr>
+          <w:rtl w:val="0"/>
+        </w:rPr>
       </w:r>
     </w:p>
     <w:sectPr>
@@ -13657,6 +13837,20 @@
       <w:vertAlign w:val="baseline"/>
     </w:rPr>
   </w:style>
+  <w:style w:type="table" w:styleId="TableNormal" w:default="1">
+    <w:name w:val="TableNormal"/>
+    <w:tblPr>
+      <w:tblCellMar>
+        <w:top w:w="100.0" w:type="dxa"/>
+        <w:left w:w="100.0" w:type="dxa"/>
+        <w:bottom w:w="100.0" w:type="dxa"/>
+        <w:right w:w="100.0" w:type="dxa"/>
+      </w:tblCellMar>
+    </w:tblPr>
+  </w:style>
+  <w:style w:type="paragraph" w:styleId="Normal" w:default="1">
+    <w:name w:val="normal"/>
+  </w:style>
   <w:style w:type="paragraph" w:styleId="Strong">
     <w:name w:val="Strong"/>
     <w:basedOn w:val="Normal"/>
@@ -13755,6 +13949,188 @@
       <w:sz w:val="20"/>
       <w:szCs w:val="20"/>
     </w:rPr>
+  </w:style>
+  <w:style w:type="table" w:styleId="Table1">
+    <w:basedOn w:val="TableNormal"/>
+    <w:tblPr>
+      <w:tblStyleRowBandSize w:val="1"/>
+      <w:tblStyleColBandSize w:val="1"/>
+      <w:tblCellMar>
+        <w:top w:w="0.0" w:type="dxa"/>
+        <w:left w:w="115.0" w:type="dxa"/>
+        <w:bottom w:w="0.0" w:type="dxa"/>
+        <w:right w:w="115.0" w:type="dxa"/>
+      </w:tblCellMar>
+    </w:tblPr>
+  </w:style>
+  <w:style w:type="table" w:styleId="Table2">
+    <w:basedOn w:val="TableNormal"/>
+    <w:tblPr>
+      <w:tblStyleRowBandSize w:val="1"/>
+      <w:tblStyleColBandSize w:val="1"/>
+      <w:tblCellMar>
+        <w:top w:w="0.0" w:type="dxa"/>
+        <w:left w:w="115.0" w:type="dxa"/>
+        <w:bottom w:w="0.0" w:type="dxa"/>
+        <w:right w:w="115.0" w:type="dxa"/>
+      </w:tblCellMar>
+    </w:tblPr>
+  </w:style>
+  <w:style w:type="table" w:styleId="Table3">
+    <w:basedOn w:val="TableNormal"/>
+    <w:tblPr>
+      <w:tblStyleRowBandSize w:val="1"/>
+      <w:tblStyleColBandSize w:val="1"/>
+      <w:tblCellMar>
+        <w:top w:w="0.0" w:type="dxa"/>
+        <w:left w:w="115.0" w:type="dxa"/>
+        <w:bottom w:w="0.0" w:type="dxa"/>
+        <w:right w:w="115.0" w:type="dxa"/>
+      </w:tblCellMar>
+    </w:tblPr>
+  </w:style>
+  <w:style w:type="table" w:styleId="Table4">
+    <w:basedOn w:val="TableNormal"/>
+    <w:tblPr>
+      <w:tblStyleRowBandSize w:val="1"/>
+      <w:tblStyleColBandSize w:val="1"/>
+      <w:tblCellMar>
+        <w:top w:w="0.0" w:type="dxa"/>
+        <w:left w:w="115.0" w:type="dxa"/>
+        <w:bottom w:w="0.0" w:type="dxa"/>
+        <w:right w:w="115.0" w:type="dxa"/>
+      </w:tblCellMar>
+    </w:tblPr>
+  </w:style>
+  <w:style w:type="table" w:styleId="Table5">
+    <w:basedOn w:val="TableNormal"/>
+    <w:tblPr>
+      <w:tblStyleRowBandSize w:val="1"/>
+      <w:tblStyleColBandSize w:val="1"/>
+      <w:tblCellMar>
+        <w:top w:w="0.0" w:type="dxa"/>
+        <w:left w:w="115.0" w:type="dxa"/>
+        <w:bottom w:w="0.0" w:type="dxa"/>
+        <w:right w:w="115.0" w:type="dxa"/>
+      </w:tblCellMar>
+    </w:tblPr>
+  </w:style>
+  <w:style w:type="table" w:styleId="Table6">
+    <w:basedOn w:val="TableNormal"/>
+    <w:tblPr>
+      <w:tblStyleRowBandSize w:val="1"/>
+      <w:tblStyleColBandSize w:val="1"/>
+      <w:tblCellMar>
+        <w:top w:w="0.0" w:type="dxa"/>
+        <w:left w:w="115.0" w:type="dxa"/>
+        <w:bottom w:w="0.0" w:type="dxa"/>
+        <w:right w:w="115.0" w:type="dxa"/>
+      </w:tblCellMar>
+    </w:tblPr>
+  </w:style>
+  <w:style w:type="table" w:styleId="Table7">
+    <w:basedOn w:val="TableNormal"/>
+    <w:tblPr>
+      <w:tblStyleRowBandSize w:val="1"/>
+      <w:tblStyleColBandSize w:val="1"/>
+      <w:tblCellMar>
+        <w:top w:w="0.0" w:type="dxa"/>
+        <w:left w:w="115.0" w:type="dxa"/>
+        <w:bottom w:w="0.0" w:type="dxa"/>
+        <w:right w:w="115.0" w:type="dxa"/>
+      </w:tblCellMar>
+    </w:tblPr>
+  </w:style>
+  <w:style w:type="table" w:styleId="Table8">
+    <w:basedOn w:val="TableNormal"/>
+    <w:tblPr>
+      <w:tblStyleRowBandSize w:val="1"/>
+      <w:tblStyleColBandSize w:val="1"/>
+      <w:tblCellMar>
+        <w:top w:w="0.0" w:type="dxa"/>
+        <w:left w:w="115.0" w:type="dxa"/>
+        <w:bottom w:w="0.0" w:type="dxa"/>
+        <w:right w:w="115.0" w:type="dxa"/>
+      </w:tblCellMar>
+    </w:tblPr>
+  </w:style>
+  <w:style w:type="table" w:styleId="Table9">
+    <w:basedOn w:val="TableNormal"/>
+    <w:tblPr>
+      <w:tblStyleRowBandSize w:val="1"/>
+      <w:tblStyleColBandSize w:val="1"/>
+      <w:tblCellMar>
+        <w:top w:w="0.0" w:type="dxa"/>
+        <w:left w:w="115.0" w:type="dxa"/>
+        <w:bottom w:w="0.0" w:type="dxa"/>
+        <w:right w:w="115.0" w:type="dxa"/>
+      </w:tblCellMar>
+    </w:tblPr>
+  </w:style>
+  <w:style w:type="table" w:styleId="Table10">
+    <w:basedOn w:val="TableNormal"/>
+    <w:tblPr>
+      <w:tblStyleRowBandSize w:val="1"/>
+      <w:tblStyleColBandSize w:val="1"/>
+      <w:tblCellMar>
+        <w:top w:w="0.0" w:type="dxa"/>
+        <w:left w:w="115.0" w:type="dxa"/>
+        <w:bottom w:w="0.0" w:type="dxa"/>
+        <w:right w:w="115.0" w:type="dxa"/>
+      </w:tblCellMar>
+    </w:tblPr>
+  </w:style>
+  <w:style w:type="table" w:styleId="Table11">
+    <w:basedOn w:val="TableNormal"/>
+    <w:tblPr>
+      <w:tblStyleRowBandSize w:val="1"/>
+      <w:tblStyleColBandSize w:val="1"/>
+      <w:tblCellMar>
+        <w:top w:w="0.0" w:type="dxa"/>
+        <w:left w:w="115.0" w:type="dxa"/>
+        <w:bottom w:w="0.0" w:type="dxa"/>
+        <w:right w:w="115.0" w:type="dxa"/>
+      </w:tblCellMar>
+    </w:tblPr>
+  </w:style>
+  <w:style w:type="table" w:styleId="Table12">
+    <w:basedOn w:val="TableNormal"/>
+    <w:tblPr>
+      <w:tblStyleRowBandSize w:val="1"/>
+      <w:tblStyleColBandSize w:val="1"/>
+      <w:tblCellMar>
+        <w:top w:w="0.0" w:type="dxa"/>
+        <w:left w:w="115.0" w:type="dxa"/>
+        <w:bottom w:w="0.0" w:type="dxa"/>
+        <w:right w:w="115.0" w:type="dxa"/>
+      </w:tblCellMar>
+    </w:tblPr>
+  </w:style>
+  <w:style w:type="table" w:styleId="Table13">
+    <w:basedOn w:val="TableNormal"/>
+    <w:tblPr>
+      <w:tblStyleRowBandSize w:val="1"/>
+      <w:tblStyleColBandSize w:val="1"/>
+      <w:tblCellMar>
+        <w:top w:w="0.0" w:type="dxa"/>
+        <w:left w:w="115.0" w:type="dxa"/>
+        <w:bottom w:w="0.0" w:type="dxa"/>
+        <w:right w:w="115.0" w:type="dxa"/>
+      </w:tblCellMar>
+    </w:tblPr>
+  </w:style>
+  <w:style w:type="table" w:styleId="Table14">
+    <w:basedOn w:val="TableNormal"/>
+    <w:tblPr>
+      <w:tblStyleRowBandSize w:val="1"/>
+      <w:tblStyleColBandSize w:val="1"/>
+      <w:tblCellMar>
+        <w:top w:w="0.0" w:type="dxa"/>
+        <w:left w:w="115.0" w:type="dxa"/>
+        <w:bottom w:w="0.0" w:type="dxa"/>
+        <w:right w:w="115.0" w:type="dxa"/>
+      </w:tblCellMar>
+    </w:tblPr>
   </w:style>
   <w:style w:type="paragraph" w:styleId="Subtitle">
     <w:name w:val="Subtitle"/>
@@ -14282,7 +14658,7 @@
 
 <file path=customXML/item1.xml><?xml version="1.0" encoding="utf-8"?>
 <go:gDocsCustomXmlDataStorage xmlns:go="http://customooxmlschemas.google.com/" xmlns:r="http://schemas.openxmlformats.org/officeDocument/2006/relationships" uri="GoogleDocsCustomDataVersion2">
-  <go:docsCustomData xmlns:go="http://customooxmlschemas.google.com/" roundtripDataSignature="AMtx7mjBfYXT25P5m+j/2V907Hm1TW9iMw==">CgMxLjA4AHIhMVhMdDVUV09GTG5CTm90dGRHOUh0Z21ILWFGNUtfVDdT</go:docsCustomData>
+  <go:docsCustomData xmlns:go="http://customooxmlschemas.google.com/" roundtripDataSignature="AMtx7miLQUgWeaviSoMYEdAGsivncg4cUg==">CgMxLjA4AHIhMVhVN1pFUnVLXzlfQzE5WFFwVWQ2TUI4SzVFSmVRc3hF</go:docsCustomData>
 </go:gDocsCustomXmlDataStorage>
 </file>
 

</xml_diff>

<commit_message>
Align vue-agent with main
</commit_message>
<xml_diff>
--- a/Waitless-Cahier-des-charges.docx
+++ b/Waitless-Cahier-des-charges.docx
@@ -797,6 +797,11 @@
         </w:rPr>
         <w:t xml:space="preserve"> passées sur place avant l'entrée.</w:t>
       </w:r>
+      <w:r>
+        <w:rPr>
+          <w:rtl w:val="0"/>
+        </w:rPr>
+      </w:r>
     </w:p>
     <w:p>
       <w:pPr>
@@ -840,6 +845,11 @@
         </w:rPr>
         <w:t xml:space="preserve">Rendre l'attente prévisible : écart inférieur à 10 % entre le temps annoncé et le temps réel.</w:t>
       </w:r>
+      <w:r>
+        <w:rPr>
+          <w:rtl w:val="0"/>
+        </w:rPr>
+      </w:r>
     </w:p>
     <w:p>
       <w:pPr>
@@ -883,6 +893,11 @@
         </w:rPr>
         <w:t xml:space="preserve">Faire vivre trois statuts de visiteurs (Humain, Saiyan, Super Saiyan) sans sacrifier la file classique.</w:t>
       </w:r>
+      <w:r>
+        <w:rPr>
+          <w:rtl w:val="0"/>
+        </w:rPr>
+      </w:r>
     </w:p>
     <w:p>
       <w:pPr>
@@ -926,6 +941,11 @@
         </w:rPr>
         <w:t xml:space="preserve">Ne jamais promettre un passage impossible à honorer avant la fermeture de 19h00.</w:t>
       </w:r>
+      <w:r>
+        <w:rPr>
+          <w:rtl w:val="0"/>
+        </w:rPr>
+      </w:r>
     </w:p>
     <w:p>
       <w:pPr>
@@ -969,6 +989,11 @@
         </w:rPr>
         <w:t xml:space="preserve">Résister aux incidents : aucune perte de position en cas de panne ou d'arrêt de service.</w:t>
       </w:r>
+      <w:r>
+        <w:rPr>
+          <w:rtl w:val="0"/>
+        </w:rPr>
+      </w:r>
     </w:p>
     <w:p>
       <w:pPr>
@@ -1011,6 +1036,11 @@
           <w:rtl w:val="0"/>
         </w:rPr>
         <w:t xml:space="preserve">Collecter le strict minimum de données personnelles, sous contrôle du DPO du parc.</w:t>
+      </w:r>
+      <w:r>
+        <w:rPr>
+          <w:rtl w:val="0"/>
+        </w:rPr>
       </w:r>
     </w:p>
     <w:p>
@@ -1247,7 +1277,7 @@
                 <w:szCs w:val="18"/>
                 <w:rtl w:val="0"/>
               </w:rPr>
-              <w:t xml:space="preserve">Cycle de 20 minutes pour 20 visiteurs, soit un débit nominal de 60 visiteurs par heure</w:t>
+              <w:t xml:space="preserve">Environ 8000 visiteurs</w:t>
             </w:r>
             <w:r>
               <w:rPr>
@@ -2434,6 +2464,11 @@
         </w:rPr>
         <w:t xml:space="preserve">Le visiteur se connecte par un lien.</w:t>
       </w:r>
+      <w:r>
+        <w:rPr>
+          <w:rtl w:val="0"/>
+        </w:rPr>
+      </w:r>
     </w:p>
     <w:p>
       <w:pPr>
@@ -2477,6 +2512,11 @@
         </w:rPr>
         <w:t xml:space="preserve">Il accepte les conditions et la décharge de responsabilité liée à la forte pesanteur, puis déclare son aptitude ; seul le statut « apte » ou « non apte » est conservé.</w:t>
       </w:r>
+      <w:r>
+        <w:rPr>
+          <w:rtl w:val="0"/>
+        </w:rPr>
+      </w:r>
     </w:p>
     <w:p>
       <w:pPr>
@@ -2520,6 +2560,11 @@
         </w:rPr>
         <w:t xml:space="preserve">L'application affiche l'attente estimée pour son statut et l'heure prévisionnelle de clôture des inscriptions.</w:t>
       </w:r>
+      <w:r>
+        <w:rPr>
+          <w:rtl w:val="0"/>
+        </w:rPr>
+      </w:r>
     </w:p>
     <w:p>
       <w:pPr>
@@ -2563,6 +2608,11 @@
         </w:rPr>
         <w:t xml:space="preserve">Il rejoint la file : un ticket est créé avec un rang d'arrivée définitif et une estimation sous forme de fourchette.</w:t>
       </w:r>
+      <w:r>
+        <w:rPr>
+          <w:rtl w:val="0"/>
+        </w:rPr>
+      </w:r>
     </w:p>
     <w:p>
       <w:pPr>
@@ -2606,6 +2656,11 @@
         </w:rPr>
         <w:t xml:space="preserve">Un Super Saiyan est convoqué immédiatement ; un Saiyan ne peut s'inscrire que si la garantie de 30 minutes reste tenable.</w:t>
       </w:r>
+      <w:r>
+        <w:rPr>
+          <w:rtl w:val="0"/>
+        </w:rPr>
+      </w:r>
     </w:p>
     <w:p>
       <w:pPr>
@@ -2672,6 +2727,11 @@
         </w:rPr>
         <w:t xml:space="preserve">Le visiteur quitte l'application et profite du parc ; sa position est recalculée toutes les 30 secondes.</w:t>
       </w:r>
+      <w:r>
+        <w:rPr>
+          <w:rtl w:val="0"/>
+        </w:rPr>
+      </w:r>
     </w:p>
     <w:p>
       <w:pPr>
@@ -2715,6 +2775,11 @@
         </w:rPr>
         <w:t xml:space="preserve">Il est notifié si l'estimation se dégrade nettement, et averti si la fermeture de 19h00 menace son passage.</w:t>
       </w:r>
+      <w:r>
+        <w:rPr>
+          <w:rtl w:val="0"/>
+        </w:rPr>
+      </w:r>
     </w:p>
     <w:p>
       <w:pPr>
@@ -2758,6 +2823,11 @@
         </w:rPr>
         <w:t xml:space="preserve">Lorsque des places se libèrent, le système le convoque par e-mail : il dispose de 10 minutes pour se présenter.</w:t>
       </w:r>
+      <w:r>
+        <w:rPr>
+          <w:rtl w:val="0"/>
+        </w:rPr>
+      </w:r>
     </w:p>
     <w:p>
       <w:pPr>
@@ -2826,6 +2896,11 @@
         </w:rPr>
         <w:t xml:space="preserve">, à l'agent d'accès.</w:t>
       </w:r>
+      <w:r>
+        <w:rPr>
+          <w:rtl w:val="0"/>
+        </w:rPr>
+      </w:r>
     </w:p>
     <w:p>
       <w:pPr>
@@ -2868,6 +2943,11 @@
           <w:rtl w:val="0"/>
         </w:rPr>
         <w:t xml:space="preserve">L'agent scanne, obtient un verdict immédiat, contrôle la pièce d'identité puis valide l'entrée.</w:t>
+      </w:r>
+      <w:r>
+        <w:rPr>
+          <w:rtl w:val="0"/>
+        </w:rPr>
       </w:r>
     </w:p>
     <w:p>
@@ -6617,6 +6697,11 @@
         </w:rPr>
         <w:t xml:space="preserve">Le débit nominal de l'attraction est corrigé par le débit réellement observé et par l'occupation de la salle d'attente mesurée par le capteur.</w:t>
       </w:r>
+      <w:r>
+        <w:rPr>
+          <w:rtl w:val="0"/>
+        </w:rPr>
+      </w:r>
     </w:p>
     <w:p>
       <w:pPr>
@@ -6660,6 +6745,11 @@
         </w:rPr>
         <w:t xml:space="preserve">L'attente d'un nouveau ticket intègre les passages prioritaires attendus pendant cette attente, par un calcul itératif qui converge en quelques passes.</w:t>
       </w:r>
+      <w:r>
+        <w:rPr>
+          <w:rtl w:val="0"/>
+        </w:rPr>
+      </w:r>
     </w:p>
     <w:p>
       <w:pPr>
@@ -6703,6 +6793,11 @@
         </w:rPr>
         <w:t xml:space="preserve">Une fourchette est affichée plutôt qu'une valeur sèche ; elle s'élargit après un incident ou en cas de contexte défavorable.</w:t>
       </w:r>
+      <w:r>
+        <w:rPr>
+          <w:rtl w:val="0"/>
+        </w:rPr>
+      </w:r>
     </w:p>
     <w:p>
       <w:pPr>
@@ -6745,6 +6840,11 @@
           <w:rtl w:val="0"/>
         </w:rPr>
         <w:t xml:space="preserve">La sélection des visiteurs à convoquer combine l'échéance des garanties, les quotas par statut et l'ordre d'arrivée.</w:t>
+      </w:r>
+      <w:r>
+        <w:rPr>
+          <w:rtl w:val="0"/>
+        </w:rPr>
       </w:r>
     </w:p>
     <w:p>
@@ -9893,6 +9993,11 @@
         </w:rPr>
         <w:t xml:space="preserve">Le visiteur se connecte par lien e-mail à usage unique : aucun mot de passe, donc aucune donnée d'authentification à protéger.</w:t>
       </w:r>
+      <w:r>
+        <w:rPr>
+          <w:rtl w:val="0"/>
+        </w:rPr>
+      </w:r>
     </w:p>
     <w:p>
       <w:pPr>
@@ -9936,6 +10041,11 @@
         </w:rPr>
         <w:t xml:space="preserve">Le QR code est nominatif et régénéré toutes les 30 secondes : une capture d'écran partagée devient inutilisable en quelques instants.</w:t>
       </w:r>
+      <w:r>
+        <w:rPr>
+          <w:rtl w:val="0"/>
+        </w:rPr>
+      </w:r>
     </w:p>
     <w:p>
       <w:pPr>
@@ -9979,6 +10089,11 @@
         </w:rPr>
         <w:t xml:space="preserve">Chaque jeton n'est utilisable qu'une fois et n'est valable que le jour même, la clé de signature étant dérivée de la date d'exploitation.</w:t>
       </w:r>
+      <w:r>
+        <w:rPr>
+          <w:rtl w:val="0"/>
+        </w:rPr>
+      </w:r>
     </w:p>
     <w:p>
       <w:pPr>
@@ -10022,6 +10137,11 @@
         </w:rPr>
         <w:t xml:space="preserve">Le jeton n'est actif qu'entre la convocation et l'expiration du délai ; un désistement, un retrait ou une purge le révoquent immédiatement.</w:t>
       </w:r>
+      <w:r>
+        <w:rPr>
+          <w:rtl w:val="0"/>
+        </w:rPr>
+      </w:r>
     </w:p>
     <w:p>
       <w:pPr>
@@ -10064,6 +10184,11 @@
           <w:rtl w:val="0"/>
         </w:rPr>
         <w:t xml:space="preserve">Le QR ne vaut pas identité : l'agent contrôle la pièce d'identité physique, sans en saisir ni en conserver la moindre donnée.</w:t>
+      </w:r>
+      <w:r>
+        <w:rPr>
+          <w:rtl w:val="0"/>
+        </w:rPr>
       </w:r>
     </w:p>
     <w:p>
@@ -11059,6 +11184,11 @@
         </w:rPr>
         <w:t xml:space="preserve">Inscription du traitement au registre du parc et contrat de sous-traitance avec Waitless.</w:t>
       </w:r>
+      <w:r>
+        <w:rPr>
+          <w:rtl w:val="0"/>
+        </w:rPr>
+      </w:r>
     </w:p>
     <w:p>
       <w:pPr>
@@ -11102,6 +11232,11 @@
         </w:rPr>
         <w:t xml:space="preserve">Formulation de la question d'aptitude en auto-déclaration, afin qu'aucune pathologie ne soit jamais transmise.</w:t>
       </w:r>
+      <w:r>
+        <w:rPr>
+          <w:rtl w:val="0"/>
+        </w:rPr>
+      </w:r>
     </w:p>
     <w:p>
       <w:pPr>
@@ -11145,6 +11280,11 @@
         </w:rPr>
         <w:t xml:space="preserve">Information sur site concernant le capteur de présence et justification de sa finalité strictement opérationnelle.</w:t>
       </w:r>
+      <w:r>
+        <w:rPr>
+          <w:rtl w:val="0"/>
+        </w:rPr>
+      </w:r>
     </w:p>
     <w:p>
       <w:pPr>
@@ -11188,6 +11328,11 @@
         </w:rPr>
         <w:t xml:space="preserve">Validation des durées de conservation et de la politique d'anonymisation.</w:t>
       </w:r>
+      <w:r>
+        <w:rPr>
+          <w:rtl w:val="0"/>
+        </w:rPr>
+      </w:r>
     </w:p>
     <w:p>
       <w:pPr>
@@ -11231,6 +11376,11 @@
         </w:rPr>
         <w:t xml:space="preserve">Opportunité d'une analyse d'impact allégée, à trancher au regard de la question d'aptitude et du capteur.</w:t>
       </w:r>
+      <w:r>
+        <w:rPr>
+          <w:rtl w:val="0"/>
+        </w:rPr>
+      </w:r>
     </w:p>
     <w:p>
       <w:pPr>
@@ -11273,6 +11423,11 @@
           <w:rtl w:val="0"/>
         </w:rPr>
         <w:t xml:space="preserve">Exercice des droits (accès, export, effacement, retrait du consentement) directement dans l'application.</w:t>
+      </w:r>
+      <w:r>
+        <w:rPr>
+          <w:rtl w:val="0"/>
+        </w:rPr>
       </w:r>
     </w:p>
     <w:p>
@@ -12957,6 +13112,11 @@
         </w:rPr>
         <w:t xml:space="preserve">Capacité et durée réelles d’un cycle de la Salle du Temps.</w:t>
       </w:r>
+      <w:r>
+        <w:rPr>
+          <w:rtl w:val="0"/>
+        </w:rPr>
+      </w:r>
     </w:p>
     <w:p>
       <w:pPr>
@@ -13000,6 +13160,11 @@
         </w:rPr>
         <w:t xml:space="preserve">Mode d'attribution des statuts : billetterie amont ou surclassement dans l'application.</w:t>
       </w:r>
+      <w:r>
+        <w:rPr>
+          <w:rtl w:val="0"/>
+        </w:rPr>
+      </w:r>
     </w:p>
     <w:p>
       <w:pPr>
@@ -13043,6 +13208,11 @@
         </w:rPr>
         <w:t xml:space="preserve">Geste commercial éventuel pour un visiteur non servi à la fermeture.</w:t>
       </w:r>
+      <w:r>
+        <w:rPr>
+          <w:rtl w:val="0"/>
+        </w:rPr>
+      </w:r>
     </w:p>
     <w:p>
       <w:pPr>
@@ -13086,6 +13256,11 @@
         </w:rPr>
         <w:t xml:space="preserve">Gestion des groupes et des familles : un ticket par personne ou un ticket collectif.</w:t>
       </w:r>
+      <w:r>
+        <w:rPr>
+          <w:rtl w:val="0"/>
+        </w:rPr>
+      </w:r>
     </w:p>
     <w:p>
       <w:pPr>
@@ -13128,6 +13303,11 @@
           <w:rtl w:val="0"/>
         </w:rPr>
         <w:t xml:space="preserve">Ajout d'un canal de notification complémentaire (push ou SMS).</w:t>
+      </w:r>
+      <w:r>
+        <w:rPr>
+          <w:rtl w:val="0"/>
+        </w:rPr>
       </w:r>
     </w:p>
     <w:sectPr>
@@ -13657,6 +13837,20 @@
       <w:vertAlign w:val="baseline"/>
     </w:rPr>
   </w:style>
+  <w:style w:type="table" w:styleId="TableNormal" w:default="1">
+    <w:name w:val="TableNormal"/>
+    <w:tblPr>
+      <w:tblCellMar>
+        <w:top w:w="100.0" w:type="dxa"/>
+        <w:left w:w="100.0" w:type="dxa"/>
+        <w:bottom w:w="100.0" w:type="dxa"/>
+        <w:right w:w="100.0" w:type="dxa"/>
+      </w:tblCellMar>
+    </w:tblPr>
+  </w:style>
+  <w:style w:type="paragraph" w:styleId="Normal" w:default="1">
+    <w:name w:val="normal"/>
+  </w:style>
   <w:style w:type="paragraph" w:styleId="Strong">
     <w:name w:val="Strong"/>
     <w:basedOn w:val="Normal"/>
@@ -13755,6 +13949,188 @@
       <w:sz w:val="20"/>
       <w:szCs w:val="20"/>
     </w:rPr>
+  </w:style>
+  <w:style w:type="table" w:styleId="Table1">
+    <w:basedOn w:val="TableNormal"/>
+    <w:tblPr>
+      <w:tblStyleRowBandSize w:val="1"/>
+      <w:tblStyleColBandSize w:val="1"/>
+      <w:tblCellMar>
+        <w:top w:w="0.0" w:type="dxa"/>
+        <w:left w:w="115.0" w:type="dxa"/>
+        <w:bottom w:w="0.0" w:type="dxa"/>
+        <w:right w:w="115.0" w:type="dxa"/>
+      </w:tblCellMar>
+    </w:tblPr>
+  </w:style>
+  <w:style w:type="table" w:styleId="Table2">
+    <w:basedOn w:val="TableNormal"/>
+    <w:tblPr>
+      <w:tblStyleRowBandSize w:val="1"/>
+      <w:tblStyleColBandSize w:val="1"/>
+      <w:tblCellMar>
+        <w:top w:w="0.0" w:type="dxa"/>
+        <w:left w:w="115.0" w:type="dxa"/>
+        <w:bottom w:w="0.0" w:type="dxa"/>
+        <w:right w:w="115.0" w:type="dxa"/>
+      </w:tblCellMar>
+    </w:tblPr>
+  </w:style>
+  <w:style w:type="table" w:styleId="Table3">
+    <w:basedOn w:val="TableNormal"/>
+    <w:tblPr>
+      <w:tblStyleRowBandSize w:val="1"/>
+      <w:tblStyleColBandSize w:val="1"/>
+      <w:tblCellMar>
+        <w:top w:w="0.0" w:type="dxa"/>
+        <w:left w:w="115.0" w:type="dxa"/>
+        <w:bottom w:w="0.0" w:type="dxa"/>
+        <w:right w:w="115.0" w:type="dxa"/>
+      </w:tblCellMar>
+    </w:tblPr>
+  </w:style>
+  <w:style w:type="table" w:styleId="Table4">
+    <w:basedOn w:val="TableNormal"/>
+    <w:tblPr>
+      <w:tblStyleRowBandSize w:val="1"/>
+      <w:tblStyleColBandSize w:val="1"/>
+      <w:tblCellMar>
+        <w:top w:w="0.0" w:type="dxa"/>
+        <w:left w:w="115.0" w:type="dxa"/>
+        <w:bottom w:w="0.0" w:type="dxa"/>
+        <w:right w:w="115.0" w:type="dxa"/>
+      </w:tblCellMar>
+    </w:tblPr>
+  </w:style>
+  <w:style w:type="table" w:styleId="Table5">
+    <w:basedOn w:val="TableNormal"/>
+    <w:tblPr>
+      <w:tblStyleRowBandSize w:val="1"/>
+      <w:tblStyleColBandSize w:val="1"/>
+      <w:tblCellMar>
+        <w:top w:w="0.0" w:type="dxa"/>
+        <w:left w:w="115.0" w:type="dxa"/>
+        <w:bottom w:w="0.0" w:type="dxa"/>
+        <w:right w:w="115.0" w:type="dxa"/>
+      </w:tblCellMar>
+    </w:tblPr>
+  </w:style>
+  <w:style w:type="table" w:styleId="Table6">
+    <w:basedOn w:val="TableNormal"/>
+    <w:tblPr>
+      <w:tblStyleRowBandSize w:val="1"/>
+      <w:tblStyleColBandSize w:val="1"/>
+      <w:tblCellMar>
+        <w:top w:w="0.0" w:type="dxa"/>
+        <w:left w:w="115.0" w:type="dxa"/>
+        <w:bottom w:w="0.0" w:type="dxa"/>
+        <w:right w:w="115.0" w:type="dxa"/>
+      </w:tblCellMar>
+    </w:tblPr>
+  </w:style>
+  <w:style w:type="table" w:styleId="Table7">
+    <w:basedOn w:val="TableNormal"/>
+    <w:tblPr>
+      <w:tblStyleRowBandSize w:val="1"/>
+      <w:tblStyleColBandSize w:val="1"/>
+      <w:tblCellMar>
+        <w:top w:w="0.0" w:type="dxa"/>
+        <w:left w:w="115.0" w:type="dxa"/>
+        <w:bottom w:w="0.0" w:type="dxa"/>
+        <w:right w:w="115.0" w:type="dxa"/>
+      </w:tblCellMar>
+    </w:tblPr>
+  </w:style>
+  <w:style w:type="table" w:styleId="Table8">
+    <w:basedOn w:val="TableNormal"/>
+    <w:tblPr>
+      <w:tblStyleRowBandSize w:val="1"/>
+      <w:tblStyleColBandSize w:val="1"/>
+      <w:tblCellMar>
+        <w:top w:w="0.0" w:type="dxa"/>
+        <w:left w:w="115.0" w:type="dxa"/>
+        <w:bottom w:w="0.0" w:type="dxa"/>
+        <w:right w:w="115.0" w:type="dxa"/>
+      </w:tblCellMar>
+    </w:tblPr>
+  </w:style>
+  <w:style w:type="table" w:styleId="Table9">
+    <w:basedOn w:val="TableNormal"/>
+    <w:tblPr>
+      <w:tblStyleRowBandSize w:val="1"/>
+      <w:tblStyleColBandSize w:val="1"/>
+      <w:tblCellMar>
+        <w:top w:w="0.0" w:type="dxa"/>
+        <w:left w:w="115.0" w:type="dxa"/>
+        <w:bottom w:w="0.0" w:type="dxa"/>
+        <w:right w:w="115.0" w:type="dxa"/>
+      </w:tblCellMar>
+    </w:tblPr>
+  </w:style>
+  <w:style w:type="table" w:styleId="Table10">
+    <w:basedOn w:val="TableNormal"/>
+    <w:tblPr>
+      <w:tblStyleRowBandSize w:val="1"/>
+      <w:tblStyleColBandSize w:val="1"/>
+      <w:tblCellMar>
+        <w:top w:w="0.0" w:type="dxa"/>
+        <w:left w:w="115.0" w:type="dxa"/>
+        <w:bottom w:w="0.0" w:type="dxa"/>
+        <w:right w:w="115.0" w:type="dxa"/>
+      </w:tblCellMar>
+    </w:tblPr>
+  </w:style>
+  <w:style w:type="table" w:styleId="Table11">
+    <w:basedOn w:val="TableNormal"/>
+    <w:tblPr>
+      <w:tblStyleRowBandSize w:val="1"/>
+      <w:tblStyleColBandSize w:val="1"/>
+      <w:tblCellMar>
+        <w:top w:w="0.0" w:type="dxa"/>
+        <w:left w:w="115.0" w:type="dxa"/>
+        <w:bottom w:w="0.0" w:type="dxa"/>
+        <w:right w:w="115.0" w:type="dxa"/>
+      </w:tblCellMar>
+    </w:tblPr>
+  </w:style>
+  <w:style w:type="table" w:styleId="Table12">
+    <w:basedOn w:val="TableNormal"/>
+    <w:tblPr>
+      <w:tblStyleRowBandSize w:val="1"/>
+      <w:tblStyleColBandSize w:val="1"/>
+      <w:tblCellMar>
+        <w:top w:w="0.0" w:type="dxa"/>
+        <w:left w:w="115.0" w:type="dxa"/>
+        <w:bottom w:w="0.0" w:type="dxa"/>
+        <w:right w:w="115.0" w:type="dxa"/>
+      </w:tblCellMar>
+    </w:tblPr>
+  </w:style>
+  <w:style w:type="table" w:styleId="Table13">
+    <w:basedOn w:val="TableNormal"/>
+    <w:tblPr>
+      <w:tblStyleRowBandSize w:val="1"/>
+      <w:tblStyleColBandSize w:val="1"/>
+      <w:tblCellMar>
+        <w:top w:w="0.0" w:type="dxa"/>
+        <w:left w:w="115.0" w:type="dxa"/>
+        <w:bottom w:w="0.0" w:type="dxa"/>
+        <w:right w:w="115.0" w:type="dxa"/>
+      </w:tblCellMar>
+    </w:tblPr>
+  </w:style>
+  <w:style w:type="table" w:styleId="Table14">
+    <w:basedOn w:val="TableNormal"/>
+    <w:tblPr>
+      <w:tblStyleRowBandSize w:val="1"/>
+      <w:tblStyleColBandSize w:val="1"/>
+      <w:tblCellMar>
+        <w:top w:w="0.0" w:type="dxa"/>
+        <w:left w:w="115.0" w:type="dxa"/>
+        <w:bottom w:w="0.0" w:type="dxa"/>
+        <w:right w:w="115.0" w:type="dxa"/>
+      </w:tblCellMar>
+    </w:tblPr>
   </w:style>
   <w:style w:type="paragraph" w:styleId="Subtitle">
     <w:name w:val="Subtitle"/>
@@ -14282,7 +14658,7 @@
 
 <file path=customXML/item1.xml><?xml version="1.0" encoding="utf-8"?>
 <go:gDocsCustomXmlDataStorage xmlns:go="http://customooxmlschemas.google.com/" xmlns:r="http://schemas.openxmlformats.org/officeDocument/2006/relationships" uri="GoogleDocsCustomDataVersion2">
-  <go:docsCustomData xmlns:go="http://customooxmlschemas.google.com/" roundtripDataSignature="AMtx7mjBfYXT25P5m+j/2V907Hm1TW9iMw==">CgMxLjA4AHIhMVhMdDVUV09GTG5CTm90dGRHOUh0Z21ILWFGNUtfVDdT</go:docsCustomData>
+  <go:docsCustomData xmlns:go="http://customooxmlschemas.google.com/" roundtripDataSignature="AMtx7miLQUgWeaviSoMYEdAGsivncg4cUg==">CgMxLjA4AHIhMVhVN1pFUnVLXzlfQzE5WFFwVWQ2TUI4SzVFSmVRc3hF</go:docsCustomData>
 </go:gDocsCustomXmlDataStorage>
 </file>
 

</xml_diff>